<commit_message>
Cartographie v2 — 4 corrections Kevin (CAS C/D, fréquence histoires, vidéos, urgence→besoin réel)
https://claude.ai/code/session_01EfNHa7paeY8TotTJGhomSK
</commit_message>
<xml_diff>
--- a/cartographie_setting_agent.docx
+++ b/cartographie_setting_agent.docx
@@ -752,7 +752,7 @@
           <w:sz w:val="22"/>
           <w:u w:val="none"/>
         </w:rPr>
-        <w:t>contact après commentaire sur un post de Matthias — le prospect vient à lui</w:t>
+        <w:t>contact après commentaire sur un post de l'utilisateur — le prospect vient à lui</w:t>
       </w:r>
     </w:p>
     <w:p>
@@ -783,59 +783,13 @@
           <w:sz w:val="22"/>
           <w:u w:val="none"/>
         </w:rPr>
-        <w:t>contact en outbound — Matthias va vers le prospect</w:t>
+        <w:t>contact en outbound — l'utilisateur va vers le prospect</w:t>
       </w:r>
     </w:p>
     <w:p>
       <w:pPr>
-        <w:spacing w:before="40" w:after="80"/>
-        <w:ind w:left="607"/>
-      </w:pPr>
-      <w:r>
-        <w:rPr>
-          <w:i/>
-          <w:color w:val="595959"/>
-          <w:sz w:val="20"/>
-        </w:rPr>
-        <w:t>→ Les deux cas ne suivent pas le même flux d'ouverture, mais convergent à partir de la Phase 2</w:t>
-      </w:r>
-    </w:p>
-    <w:p>
-      <w:pPr>
-        <w:spacing w:before="240" w:after="80"/>
-      </w:pPr>
-      <w:r>
-        <w:rPr>
-          <w:b/>
-          <w:color w:val="2E74B5"/>
-          <w:sz w:val="25"/>
-        </w:rPr>
-        <w:t>BLOC 2 — Profils personnalité</w:t>
-      </w:r>
-    </w:p>
-    <w:p>
-      <w:pPr>
         <w:spacing w:before="0" w:after="60"/>
         <w:ind w:left="369" w:hanging="238"/>
-      </w:pPr>
-      <w:r>
-        <w:rPr>
-          <w:color w:val="2E74B5"/>
-          <w:sz w:val="22"/>
-        </w:rPr>
-        <w:t xml:space="preserve">•  </w:t>
-      </w:r>
-      <w:r>
-        <w:rPr>
-          <w:sz w:val="22"/>
-        </w:rPr>
-        <w:t>Deux grands profils (adapté DISC au contexte LinkedIn) :</w:t>
-      </w:r>
-    </w:p>
-    <w:p>
-      <w:pPr>
-        <w:spacing w:before="0" w:after="60"/>
-        <w:ind w:left="737" w:hanging="238"/>
       </w:pPr>
       <w:r>
         <w:rPr>
@@ -851,7 +805,7 @@
           <w:sz w:val="22"/>
           <w:u w:val="none"/>
         </w:rPr>
-        <w:t xml:space="preserve">Profil transactionnel (rouge) : </w:t>
+        <w:t xml:space="preserve">CAS C : </w:t>
       </w:r>
       <w:r>
         <w:rPr>
@@ -860,13 +814,13 @@
           <w:sz w:val="22"/>
           <w:u w:val="none"/>
         </w:rPr>
-        <w:t>direct, efficace, peu bavard, peu expressif</w:t>
+        <w:t>le prospect envoie une demande de connexion — initiative entrante du prospect</w:t>
       </w:r>
     </w:p>
     <w:p>
       <w:pPr>
         <w:spacing w:before="0" w:after="60"/>
-        <w:ind w:left="737" w:hanging="238"/>
+        <w:ind w:left="369" w:hanging="238"/>
       </w:pPr>
       <w:r>
         <w:rPr>
@@ -882,7 +836,7 @@
           <w:sz w:val="22"/>
           <w:u w:val="none"/>
         </w:rPr>
-        <w:t xml:space="preserve">Profil conversationnel : </w:t>
+        <w:t xml:space="preserve">CAS D : </w:t>
       </w:r>
       <w:r>
         <w:rPr>
@@ -891,159 +845,21 @@
           <w:sz w:val="22"/>
           <w:u w:val="none"/>
         </w:rPr>
-        <w:t>ouvert, expressif, aime échanger, partage facilement</w:t>
+        <w:t>visiteur de profil — le prospect a visité le profil de l'utilisateur sans envoyer de message</w:t>
       </w:r>
     </w:p>
     <w:p>
       <w:pPr>
-        <w:spacing w:before="0" w:after="60"/>
-        <w:ind w:left="369" w:hanging="238"/>
-      </w:pPr>
-      <w:r>
-        <w:rPr>
-          <w:color w:val="2E74B5"/>
-          <w:sz w:val="22"/>
-        </w:rPr>
-        <w:t xml:space="preserve">•  </w:t>
-      </w:r>
-      <w:r>
-        <w:rPr>
-          <w:sz w:val="22"/>
-        </w:rPr>
-        <w:t>Comment détecter :</w:t>
-      </w:r>
-    </w:p>
-    <w:p>
-      <w:pPr>
-        <w:spacing w:before="0" w:after="60"/>
-        <w:ind w:left="737" w:hanging="238"/>
-      </w:pPr>
-      <w:r>
-        <w:rPr>
-          <w:color w:val="2E74B5"/>
-          <w:sz w:val="22"/>
-        </w:rPr>
-        <w:t xml:space="preserve">•  </w:t>
-      </w:r>
-      <w:r>
-        <w:rPr>
-          <w:sz w:val="22"/>
-        </w:rPr>
-        <w:t>Comportement en commentaires (longueur, registre)</w:t>
-      </w:r>
-    </w:p>
-    <w:p>
-      <w:pPr>
-        <w:spacing w:before="0" w:after="60"/>
-        <w:ind w:left="737" w:hanging="238"/>
-      </w:pPr>
-      <w:r>
-        <w:rPr>
-          <w:color w:val="2E74B5"/>
-          <w:sz w:val="22"/>
-        </w:rPr>
-        <w:t xml:space="preserve">•  </w:t>
-      </w:r>
-      <w:r>
-        <w:rPr>
-          <w:sz w:val="22"/>
-        </w:rPr>
-        <w:t>Ton des posts (distant/factuel vs chaleureux/narratif)</w:t>
-      </w:r>
-    </w:p>
-    <w:p>
-      <w:pPr>
-        <w:spacing w:before="0" w:after="60"/>
-        <w:ind w:left="737" w:hanging="238"/>
-      </w:pPr>
-      <w:r>
-        <w:rPr>
-          <w:color w:val="2E74B5"/>
-          <w:sz w:val="22"/>
-        </w:rPr>
-        <w:t xml:space="preserve">•  </w:t>
-      </w:r>
-      <w:r>
-        <w:rPr>
-          <w:sz w:val="22"/>
-        </w:rPr>
-        <w:t>Longueur et profondeur des réponses en DM</w:t>
-      </w:r>
-    </w:p>
-    <w:p>
-      <w:pPr>
-        <w:spacing w:before="0" w:after="60"/>
-        <w:ind w:left="369" w:hanging="238"/>
-      </w:pPr>
-      <w:r>
-        <w:rPr>
-          <w:color w:val="2E74B5"/>
-          <w:sz w:val="22"/>
-        </w:rPr>
-        <w:t xml:space="preserve">•  </w:t>
-      </w:r>
-      <w:r>
-        <w:rPr>
-          <w:sz w:val="22"/>
-        </w:rPr>
-        <w:t>Ce que ça détermine :</w:t>
-      </w:r>
-    </w:p>
-    <w:p>
-      <w:pPr>
-        <w:spacing w:before="0" w:after="60"/>
-        <w:ind w:left="737" w:hanging="238"/>
-      </w:pPr>
-      <w:r>
-        <w:rPr>
-          <w:color w:val="2E74B5"/>
-          <w:sz w:val="22"/>
-        </w:rPr>
-        <w:t xml:space="preserve">•  </w:t>
-      </w:r>
-      <w:r>
-        <w:rPr>
-          <w:sz w:val="22"/>
-        </w:rPr>
-        <w:t>Le registre adopté (direct vs chaleureux)</w:t>
-      </w:r>
-    </w:p>
-    <w:p>
-      <w:pPr>
-        <w:spacing w:before="0" w:after="60"/>
-        <w:ind w:left="737" w:hanging="238"/>
-      </w:pPr>
-      <w:r>
-        <w:rPr>
-          <w:color w:val="2E74B5"/>
-          <w:sz w:val="22"/>
-        </w:rPr>
-        <w:t xml:space="preserve">•  </w:t>
-      </w:r>
-      <w:r>
-        <w:rPr>
-          <w:sz w:val="22"/>
-        </w:rPr>
-        <w:t>Le rythme de la conversation (aller vite vs prendre le temps)</w:t>
-      </w:r>
-    </w:p>
-    <w:p>
-      <w:pPr>
-        <w:spacing w:before="0" w:after="60"/>
-        <w:ind w:left="737" w:hanging="238"/>
-      </w:pPr>
-      <w:r>
-        <w:rPr>
-          <w:color w:val="2E74B5"/>
-          <w:sz w:val="22"/>
-        </w:rPr>
-        <w:t xml:space="preserve">•  </w:t>
-      </w:r>
-      <w:r>
-        <w:rPr>
-          <w:sz w:val="22"/>
-        </w:rPr>
-        <w:t>La profondeur de questions acceptable sans brusquer</w:t>
+        <w:spacing w:before="40" w:after="80"/>
+        <w:ind w:left="607"/>
+      </w:pPr>
+      <w:r>
+        <w:rPr>
+          <w:i/>
+          <w:color w:val="595959"/>
+          <w:sz w:val="20"/>
+        </w:rPr>
+        <w:t>→ Les 4 cas ne suivent pas le même flux d'ouverture, mais convergent à partir de la Phase 2</w:t>
       </w:r>
     </w:p>
     <w:p>
@@ -1056,14 +872,40 @@
           <w:color w:val="2E74B5"/>
           <w:sz w:val="25"/>
         </w:rPr>
-        <w:t>BLOC 3 — Système de signaux</w:t>
+        <w:t>BLOC 2 — Profils personnalité</w:t>
       </w:r>
     </w:p>
     <w:p>
       <w:pPr>
-        <w:spacing w:before="0" w:after="120"/>
-        <w:ind w:left="369"/>
-      </w:pPr>
+        <w:spacing w:before="0" w:after="60"/>
+        <w:ind w:left="369" w:hanging="238"/>
+      </w:pPr>
+      <w:r>
+        <w:rPr>
+          <w:color w:val="2E74B5"/>
+          <w:sz w:val="22"/>
+        </w:rPr>
+        <w:t xml:space="preserve">•  </w:t>
+      </w:r>
+      <w:r>
+        <w:rPr>
+          <w:sz w:val="22"/>
+        </w:rPr>
+        <w:t>Deux grands profils (adapté DISC au contexte LinkedIn) :</w:t>
+      </w:r>
+    </w:p>
+    <w:p>
+      <w:pPr>
+        <w:spacing w:before="0" w:after="60"/>
+        <w:ind w:left="737" w:hanging="238"/>
+      </w:pPr>
+      <w:r>
+        <w:rPr>
+          <w:color w:val="2E74B5"/>
+          <w:sz w:val="22"/>
+        </w:rPr>
+        <w:t xml:space="preserve">•  </w:t>
+      </w:r>
       <w:r>
         <w:rPr>
           <w:b/>
@@ -1071,7 +913,7 @@
           <w:sz w:val="22"/>
           <w:u w:val="none"/>
         </w:rPr>
-        <w:t xml:space="preserve">Principe : </w:t>
+        <w:t xml:space="preserve">Profil transactionnel (rouge) : </w:t>
       </w:r>
       <w:r>
         <w:rPr>
@@ -1080,26 +922,7 @@
           <w:sz w:val="22"/>
           <w:u w:val="none"/>
         </w:rPr>
-        <w:t>IF [signal détecté]  →  THEN [action + raisonnement]</w:t>
-      </w:r>
-    </w:p>
-    <w:p>
-      <w:pPr>
-        <w:spacing w:before="0" w:after="60"/>
-        <w:ind w:left="369" w:hanging="238"/>
-      </w:pPr>
-      <w:r>
-        <w:rPr>
-          <w:color w:val="2E74B5"/>
-          <w:sz w:val="22"/>
-        </w:rPr>
-        <w:t xml:space="preserve">•  </w:t>
-      </w:r>
-      <w:r>
-        <w:rPr>
-          <w:sz w:val="22"/>
-        </w:rPr>
-        <w:t>Exemples de signaux et leurs actions associées :</w:t>
+        <w:t>direct, efficace, peu bavard, peu expressif</w:t>
       </w:r>
     </w:p>
     <w:p>
@@ -1121,7 +944,7 @@
           <w:sz w:val="22"/>
           <w:u w:val="none"/>
         </w:rPr>
-        <w:t xml:space="preserve">Signal d'engagement fort </w:t>
+        <w:t xml:space="preserve">Profil conversationnel : </w:t>
       </w:r>
       <w:r>
         <w:rPr>
@@ -1130,13 +953,13 @@
           <w:sz w:val="22"/>
           <w:u w:val="none"/>
         </w:rPr>
-        <w:t>→ approfondir, ne pas changer de sujet</w:t>
+        <w:t>ouvert, expressif, aime échanger, partage facilement</w:t>
       </w:r>
     </w:p>
     <w:p>
       <w:pPr>
         <w:spacing w:before="0" w:after="60"/>
-        <w:ind w:left="737" w:hanging="238"/>
+        <w:ind w:left="369" w:hanging="238"/>
       </w:pPr>
       <w:r>
         <w:rPr>
@@ -1145,6 +968,164 @@
         </w:rPr>
         <w:t xml:space="preserve">•  </w:t>
       </w:r>
+      <w:r>
+        <w:rPr>
+          <w:sz w:val="22"/>
+        </w:rPr>
+        <w:t>Comment détecter :</w:t>
+      </w:r>
+    </w:p>
+    <w:p>
+      <w:pPr>
+        <w:spacing w:before="0" w:after="60"/>
+        <w:ind w:left="737" w:hanging="238"/>
+      </w:pPr>
+      <w:r>
+        <w:rPr>
+          <w:color w:val="2E74B5"/>
+          <w:sz w:val="22"/>
+        </w:rPr>
+        <w:t xml:space="preserve">•  </w:t>
+      </w:r>
+      <w:r>
+        <w:rPr>
+          <w:sz w:val="22"/>
+        </w:rPr>
+        <w:t>Comportement en commentaires (longueur, registre)</w:t>
+      </w:r>
+    </w:p>
+    <w:p>
+      <w:pPr>
+        <w:spacing w:before="0" w:after="60"/>
+        <w:ind w:left="737" w:hanging="238"/>
+      </w:pPr>
+      <w:r>
+        <w:rPr>
+          <w:color w:val="2E74B5"/>
+          <w:sz w:val="22"/>
+        </w:rPr>
+        <w:t xml:space="preserve">•  </w:t>
+      </w:r>
+      <w:r>
+        <w:rPr>
+          <w:sz w:val="22"/>
+        </w:rPr>
+        <w:t>Ton des posts (distant/factuel vs chaleureux/narratif)</w:t>
+      </w:r>
+    </w:p>
+    <w:p>
+      <w:pPr>
+        <w:spacing w:before="0" w:after="60"/>
+        <w:ind w:left="737" w:hanging="238"/>
+      </w:pPr>
+      <w:r>
+        <w:rPr>
+          <w:color w:val="2E74B5"/>
+          <w:sz w:val="22"/>
+        </w:rPr>
+        <w:t xml:space="preserve">•  </w:t>
+      </w:r>
+      <w:r>
+        <w:rPr>
+          <w:sz w:val="22"/>
+        </w:rPr>
+        <w:t>Longueur et profondeur des réponses en DM</w:t>
+      </w:r>
+    </w:p>
+    <w:p>
+      <w:pPr>
+        <w:spacing w:before="0" w:after="60"/>
+        <w:ind w:left="369" w:hanging="238"/>
+      </w:pPr>
+      <w:r>
+        <w:rPr>
+          <w:color w:val="2E74B5"/>
+          <w:sz w:val="22"/>
+        </w:rPr>
+        <w:t xml:space="preserve">•  </w:t>
+      </w:r>
+      <w:r>
+        <w:rPr>
+          <w:sz w:val="22"/>
+        </w:rPr>
+        <w:t>Ce que ça détermine :</w:t>
+      </w:r>
+    </w:p>
+    <w:p>
+      <w:pPr>
+        <w:spacing w:before="0" w:after="60"/>
+        <w:ind w:left="737" w:hanging="238"/>
+      </w:pPr>
+      <w:r>
+        <w:rPr>
+          <w:color w:val="2E74B5"/>
+          <w:sz w:val="22"/>
+        </w:rPr>
+        <w:t xml:space="preserve">•  </w:t>
+      </w:r>
+      <w:r>
+        <w:rPr>
+          <w:sz w:val="22"/>
+        </w:rPr>
+        <w:t>Le registre adopté (direct vs chaleureux)</w:t>
+      </w:r>
+    </w:p>
+    <w:p>
+      <w:pPr>
+        <w:spacing w:before="0" w:after="60"/>
+        <w:ind w:left="737" w:hanging="238"/>
+      </w:pPr>
+      <w:r>
+        <w:rPr>
+          <w:color w:val="2E74B5"/>
+          <w:sz w:val="22"/>
+        </w:rPr>
+        <w:t xml:space="preserve">•  </w:t>
+      </w:r>
+      <w:r>
+        <w:rPr>
+          <w:sz w:val="22"/>
+        </w:rPr>
+        <w:t>Le rythme de la conversation (aller vite vs prendre le temps)</w:t>
+      </w:r>
+    </w:p>
+    <w:p>
+      <w:pPr>
+        <w:spacing w:before="0" w:after="60"/>
+        <w:ind w:left="737" w:hanging="238"/>
+      </w:pPr>
+      <w:r>
+        <w:rPr>
+          <w:color w:val="2E74B5"/>
+          <w:sz w:val="22"/>
+        </w:rPr>
+        <w:t xml:space="preserve">•  </w:t>
+      </w:r>
+      <w:r>
+        <w:rPr>
+          <w:sz w:val="22"/>
+        </w:rPr>
+        <w:t>La profondeur de questions acceptable sans brusquer</w:t>
+      </w:r>
+    </w:p>
+    <w:p>
+      <w:pPr>
+        <w:spacing w:before="240" w:after="80"/>
+      </w:pPr>
+      <w:r>
+        <w:rPr>
+          <w:b/>
+          <w:color w:val="2E74B5"/>
+          <w:sz w:val="25"/>
+        </w:rPr>
+        <w:t>BLOC 3 — Système de signaux</w:t>
+      </w:r>
+    </w:p>
+    <w:p>
+      <w:pPr>
+        <w:spacing w:before="0" w:after="120"/>
+        <w:ind w:left="369"/>
+      </w:pPr>
       <w:r>
         <w:rPr>
           <w:b/>
@@ -1152,7 +1133,7 @@
           <w:sz w:val="22"/>
           <w:u w:val="none"/>
         </w:rPr>
-        <w:t xml:space="preserve">Signal d'évasion </w:t>
+        <w:t xml:space="preserve">Principe : </w:t>
       </w:r>
       <w:r>
         <w:rPr>
@@ -1161,7 +1142,26 @@
           <w:sz w:val="22"/>
           <w:u w:val="none"/>
         </w:rPr>
-        <w:t>→ changer d'angle doucement, ne pas insister sur le même point</w:t>
+        <w:t>IF [signal détecté]  →  THEN [action + raisonnement]</w:t>
+      </w:r>
+    </w:p>
+    <w:p>
+      <w:pPr>
+        <w:spacing w:before="0" w:after="60"/>
+        <w:ind w:left="369" w:hanging="238"/>
+      </w:pPr>
+      <w:r>
+        <w:rPr>
+          <w:color w:val="2E74B5"/>
+          <w:sz w:val="22"/>
+        </w:rPr>
+        <w:t xml:space="preserve">•  </w:t>
+      </w:r>
+      <w:r>
+        <w:rPr>
+          <w:sz w:val="22"/>
+        </w:rPr>
+        <w:t>Exemples de signaux et leurs actions associées :</w:t>
       </w:r>
     </w:p>
     <w:p>
@@ -1183,7 +1183,7 @@
           <w:sz w:val="22"/>
           <w:u w:val="none"/>
         </w:rPr>
-        <w:t xml:space="preserve">Signal d'histoire personnelle partagée </w:t>
+        <w:t xml:space="preserve">Signal d'engagement fort </w:t>
       </w:r>
       <w:r>
         <w:rPr>
@@ -1192,7 +1192,7 @@
           <w:sz w:val="22"/>
           <w:u w:val="none"/>
         </w:rPr>
-        <w:t>→ réciprocité contextuelle (partager une histoire en miroir)</w:t>
+        <w:t>→ approfondir, ne pas changer de sujet</w:t>
       </w:r>
     </w:p>
     <w:p>
@@ -1214,7 +1214,7 @@
           <w:sz w:val="22"/>
           <w:u w:val="none"/>
         </w:rPr>
-        <w:t xml:space="preserve">Signal de désengagement </w:t>
+        <w:t xml:space="preserve">Signal d'évasion </w:t>
       </w:r>
       <w:r>
         <w:rPr>
@@ -1223,7 +1223,7 @@
           <w:sz w:val="22"/>
           <w:u w:val="none"/>
         </w:rPr>
-        <w:t>→ ne pas relancer de force, laisser respirer</w:t>
+        <w:t>→ changer d'angle doucement, ne pas insister sur le même point</w:t>
       </w:r>
     </w:p>
     <w:p>
@@ -1245,7 +1245,7 @@
           <w:sz w:val="22"/>
           <w:u w:val="none"/>
         </w:rPr>
-        <w:t xml:space="preserve">Signal de profil silencieux </w:t>
+        <w:t xml:space="preserve">Signal d'histoire personnelle partagée </w:t>
       </w:r>
       <w:r>
         <w:rPr>
@@ -1254,55 +1254,21 @@
           <w:sz w:val="22"/>
           <w:u w:val="none"/>
         </w:rPr>
-        <w:t>→ proposer alternatives A/B (à documenter lors de l'analyse des conversations)</w:t>
+        <w:t>→ réciprocité contextuelle (partager une histoire en miroir)</w:t>
       </w:r>
     </w:p>
     <w:p>
       <w:pPr>
-        <w:spacing w:before="80" w:after="100"/>
-        <w:ind w:left="369"/>
-      </w:pPr>
-      <w:r>
-        <w:rPr>
-          <w:b/>
-          <w:sz w:val="21"/>
-          <w:u w:val="single"/>
-        </w:rPr>
-        <w:t>⚠  Les histoires personnelles sont déclenchées par signal — jamais par fréquence mécanique (ex : « 1 fois sur 4 » = interdit)</w:t>
-      </w:r>
-    </w:p>
-    <w:p>
-      <w:pPr>
-        <w:spacing w:before="40" w:after="80"/>
-        <w:ind w:left="607"/>
-      </w:pPr>
-      <w:r>
-        <w:rPr>
-          <w:i/>
-          <w:color w:val="595959"/>
-          <w:sz w:val="20"/>
-        </w:rPr>
-        <w:t>→ Le contenu précis de ce bloc sera enrichi par l'analyse des 15 conversations réelles</w:t>
-      </w:r>
-    </w:p>
-    <w:p>
-      <w:pPr>
-        <w:spacing w:before="240" w:after="80"/>
-      </w:pPr>
-      <w:r>
-        <w:rPr>
-          <w:b/>
+        <w:spacing w:before="0" w:after="60"/>
+        <w:ind w:left="737" w:hanging="238"/>
+      </w:pPr>
+      <w:r>
+        <w:rPr>
           <w:color w:val="2E74B5"/>
-          <w:sz w:val="25"/>
-        </w:rPr>
-        <w:t>BLOC 4A — Ultra-personnalisation par insight profond</w:t>
-      </w:r>
-    </w:p>
-    <w:p>
-      <w:pPr>
-        <w:spacing w:before="0" w:after="120"/>
-        <w:ind w:left="369"/>
-      </w:pPr>
+          <w:sz w:val="22"/>
+        </w:rPr>
+        <w:t xml:space="preserve">•  </w:t>
+      </w:r>
       <w:r>
         <w:rPr>
           <w:b/>
@@ -1310,7 +1276,7 @@
           <w:sz w:val="22"/>
           <w:u w:val="none"/>
         </w:rPr>
-        <w:t xml:space="preserve">Principe : </w:t>
+        <w:t xml:space="preserve">Signal de désengagement </w:t>
       </w:r>
       <w:r>
         <w:rPr>
@@ -1319,6 +1285,130 @@
           <w:sz w:val="22"/>
           <w:u w:val="none"/>
         </w:rPr>
+        <w:t>→ ne pas relancer de force, laisser respirer</w:t>
+      </w:r>
+    </w:p>
+    <w:p>
+      <w:pPr>
+        <w:spacing w:before="0" w:after="60"/>
+        <w:ind w:left="737" w:hanging="238"/>
+      </w:pPr>
+      <w:r>
+        <w:rPr>
+          <w:color w:val="2E74B5"/>
+          <w:sz w:val="22"/>
+        </w:rPr>
+        <w:t xml:space="preserve">•  </w:t>
+      </w:r>
+      <w:r>
+        <w:rPr>
+          <w:b/>
+          <w:i w:val="0"/>
+          <w:sz w:val="22"/>
+          <w:u w:val="none"/>
+        </w:rPr>
+        <w:t xml:space="preserve">Signal de profil silencieux </w:t>
+      </w:r>
+      <w:r>
+        <w:rPr>
+          <w:b w:val="0"/>
+          <w:i w:val="0"/>
+          <w:sz w:val="22"/>
+          <w:u w:val="none"/>
+        </w:rPr>
+        <w:t>→ proposer alternatives A/B (à documenter lors de l'analyse des conversations)</w:t>
+      </w:r>
+    </w:p>
+    <w:p>
+      <w:pPr>
+        <w:spacing w:before="80" w:after="100"/>
+        <w:ind w:left="369"/>
+      </w:pPr>
+      <w:r>
+        <w:rPr>
+          <w:b/>
+          <w:sz w:val="21"/>
+          <w:u w:val="single"/>
+        </w:rPr>
+        <w:t>⚠  Les histoires personnelles sont déclenchées par signal — jamais par fréquence mécanique (ex : « 1 fois sur 4 » = interdit)</w:t>
+      </w:r>
+    </w:p>
+    <w:p>
+      <w:pPr>
+        <w:spacing w:before="80" w:after="100"/>
+        <w:ind w:left="369"/>
+      </w:pPr>
+      <w:r>
+        <w:rPr>
+          <w:b/>
+          <w:sz w:val="21"/>
+          <w:u w:val="single"/>
+        </w:rPr>
+        <w:t>⚠  Garde-fou de fréquence : même quand un signal est détecté, l'IA ne partage pas une histoire personnelle plus d'une fois sur 3 à 4 messages — détecter un bon pattern ne suffit pas à le systématiser</w:t>
+      </w:r>
+    </w:p>
+    <w:p>
+      <w:pPr>
+        <w:spacing w:before="40" w:after="80"/>
+        <w:ind w:left="607"/>
+      </w:pPr>
+      <w:r>
+        <w:rPr>
+          <w:i/>
+          <w:color w:val="595959"/>
+          <w:sz w:val="20"/>
+        </w:rPr>
+        <w:t>→ Double logique : (1) c'est le signal qui déclenche, pas une règle de comptage — ET (2) même avec un signal, on ne le fait pas à chaque fois</w:t>
+      </w:r>
+    </w:p>
+    <w:p>
+      <w:pPr>
+        <w:spacing w:before="40" w:after="80"/>
+        <w:ind w:left="607"/>
+      </w:pPr>
+      <w:r>
+        <w:rPr>
+          <w:i/>
+          <w:color w:val="595959"/>
+          <w:sz w:val="20"/>
+        </w:rPr>
+        <w:t>→ Le contenu précis de ce bloc sera enrichi par l'analyse des 15 conversations réelles</w:t>
+      </w:r>
+    </w:p>
+    <w:p>
+      <w:pPr>
+        <w:spacing w:before="240" w:after="80"/>
+      </w:pPr>
+      <w:r>
+        <w:rPr>
+          <w:b/>
+          <w:color w:val="2E74B5"/>
+          <w:sz w:val="25"/>
+        </w:rPr>
+        <w:t>BLOC 4A — Ultra-personnalisation par insight profond</w:t>
+      </w:r>
+    </w:p>
+    <w:p>
+      <w:pPr>
+        <w:spacing w:before="0" w:after="120"/>
+        <w:ind w:left="369"/>
+      </w:pPr>
+      <w:r>
+        <w:rPr>
+          <w:b/>
+          <w:i w:val="0"/>
+          <w:sz w:val="22"/>
+          <w:u w:val="none"/>
+        </w:rPr>
+        <w:t xml:space="preserve">Principe : </w:t>
+      </w:r>
+      <w:r>
+        <w:rPr>
+          <w:b w:val="0"/>
+          <w:i w:val="0"/>
+          <w:sz w:val="22"/>
+          <w:u w:val="none"/>
+        </w:rPr>
         <w:t xml:space="preserve">synthétiser une lecture profonde du profil en </w:t>
       </w:r>
       <w:r>
@@ -1356,7 +1446,7 @@
         <w:rPr>
           <w:sz w:val="22"/>
         </w:rPr>
-        <w:t>Ce qu'on lit :</w:t>
+        <w:t>Ce qu'on lit — tout ce qui est disponible en texte :</w:t>
       </w:r>
     </w:p>
     <w:p>
@@ -1375,7 +1465,21 @@
         <w:rPr>
           <w:sz w:val="22"/>
         </w:rPr>
-        <w:t>Posts, vidéos, section info, commentaires, stratégie visible sur le profil</w:t>
+        <w:t>Posts, section info, commentaires, stratégie visible sur le profil</w:t>
+      </w:r>
+    </w:p>
+    <w:p>
+      <w:pPr>
+        <w:spacing w:before="40" w:after="80"/>
+        <w:ind w:left="975"/>
+      </w:pPr>
+      <w:r>
+        <w:rPr>
+          <w:i/>
+          <w:color w:val="595959"/>
+          <w:sz w:val="20"/>
+        </w:rPr>
+        <w:t>→ L'agent ne peut pas lire les vidéos — il s'appuie sur le maximum d'informations textuelles disponibles</w:t>
       </w:r>
     </w:p>
     <w:p>
@@ -1504,7 +1608,7 @@
           <w:sz w:val="22"/>
           <w:u w:val="none"/>
         </w:rPr>
-        <w:t xml:space="preserve"> qui fait dire "putain, ce mec a vraiment regardé mes vidéos, mes posts, compris ma vision"</w:t>
+        <w:t xml:space="preserve"> qui fait dire "putain, ce mec a vraiment regardé mes posts, compris ma vision et ma stratégie"</w:t>
       </w:r>
     </w:p>
     <w:p>
@@ -1876,7 +1980,7 @@
           <w:sz w:val="22"/>
           <w:u w:val="single"/>
         </w:rPr>
-        <w:t>urgence</w:t>
+        <w:t>besoin réel</w:t>
       </w:r>
       <w:r>
         <w:rPr>
@@ -1943,7 +2047,7 @@
           <w:sz w:val="22"/>
           <w:u w:val="single"/>
         </w:rPr>
-        <w:t>Urgence</w:t>
+        <w:t>Besoin réel / Problème existant</w:t>
       </w:r>
       <w:r>
         <w:rPr>
@@ -1952,7 +2056,7 @@
           <w:sz w:val="22"/>
           <w:u w:val="none"/>
         </w:rPr>
-        <w:t xml:space="preserve"> = la personne a un vrai problème maintenant</w:t>
+        <w:t xml:space="preserve"> = la personne a un problème identifié et reconnu</w:t>
       </w:r>
     </w:p>
     <w:p>
@@ -1984,7 +2088,7 @@
           <w:sz w:val="22"/>
           <w:u w:val="none"/>
         </w:rPr>
-        <w:t xml:space="preserve"> → urgence absente même si solvabilité OK</w:t>
+        <w:t xml:space="preserve"> → besoin absent ou non perçu même si solvabilité OK</w:t>
       </w:r>
     </w:p>
     <w:p>
@@ -2092,7 +2196,7 @@
           <w:sz w:val="22"/>
           <w:u w:val="none"/>
         </w:rPr>
-        <w:t>urgence temporelle à vérifier — quelqu'un peut avoir les moyens mais pas le bon timing</w:t>
+        <w:t>quelqu'un peut avoir un besoin réel et les moyens, mais pas le bon timing — à vérifier discrètement</w:t>
       </w:r>
     </w:p>
     <w:p>
@@ -3256,7 +3360,7 @@
           <w:rFonts w:ascii="Courier New" w:hAnsi="Courier New"/>
           <w:sz w:val="17"/>
         </w:rPr>
-        <w:t>│  Bloc 6  — Qualification (urgence + solvabilité)            │</w:t>
+        <w:t>│  Bloc 6  — Qualification (besoin réel + solvabilité)        │</w:t>
       </w:r>
     </w:p>
     <w:p>

</xml_diff>